<commit_message>
fix(kt08): align screenshot testing with original Allure requirements
Add Sauce Demo public screenshot tests with allure-pytest attachments and generated Allure HTML report; preserve Pillow suite.

Co-authored-by: Cursor <cursoragent@cursor.com>
</commit_message>
<xml_diff>
--- a/reports/KT08.docx
+++ b/reports/KT08.docx
@@ -27,35 +27,7 @@
           <w:b w:val="0"/>
           <w:sz w:val="24"/>
         </w:rPr>
-        <w:t>Учебное заведение: ______________________________</w:t>
-      </w:r>
-    </w:p>
-    <w:p>
-      <w:pPr>
-        <w:spacing w:after="120"/>
-        <w:jc w:val="center"/>
-      </w:pPr>
-      <w:r>
-        <w:rPr>
-          <w:rFonts w:ascii="Times New Roman" w:hAnsi="Times New Roman" w:eastAsia="Times New Roman"/>
-          <w:b w:val="0"/>
-          <w:sz w:val="24"/>
-        </w:rPr>
         <w:t>Студент: _______________________________________</w:t>
-      </w:r>
-    </w:p>
-    <w:p>
-      <w:pPr>
-        <w:spacing w:after="120"/>
-        <w:jc w:val="center"/>
-      </w:pPr>
-      <w:r>
-        <w:rPr>
-          <w:rFonts w:ascii="Times New Roman" w:hAnsi="Times New Roman" w:eastAsia="Times New Roman"/>
-          <w:b w:val="0"/>
-          <w:sz w:val="24"/>
-        </w:rPr>
-        <w:t>Преподаватель: _________________________________</w:t>
       </w:r>
     </w:p>
     <w:p>
@@ -81,7 +53,7 @@
           <w:b/>
           <w:sz w:val="24"/>
         </w:rPr>
-        <w:t>КТ №8. Скриншотное тестирование (Selenium + Pillow)</w:t>
+        <w:t>КТ №8. Скриншотное тестирование веб-приложений и Allure</w:t>
       </w:r>
     </w:p>
     <w:p>
@@ -95,7 +67,7 @@
           <w:b w:val="0"/>
           <w:sz w:val="24"/>
         </w:rPr>
-        <w:t>Отчёт по контрольной точке</w:t>
+        <w:t>Отчёт по контрольной точке (compliance remediation)</w:t>
       </w:r>
     </w:p>
     <w:p>
@@ -109,7 +81,7 @@
           <w:b w:val="0"/>
           <w:sz w:val="24"/>
         </w:rPr>
-        <w:t>Дата: 2026-10-09</w:t>
+        <w:t>Дата: 2026-10-10</w:t>
       </w:r>
     </w:p>
     <w:p>
@@ -122,7 +94,7 @@
           <w:b/>
           <w:sz w:val="28"/>
         </w:rPr>
-        <w:t>1. Цель</w:t>
+        <w:t>1. Цель задания (из презентации преподавателя)</w:t>
       </w:r>
     </w:p>
     <w:p>
@@ -135,7 +107,33 @@
           <w:b w:val="0"/>
           <w:sz w:val="24"/>
         </w:rPr>
-        <w:t>Реализовать visual regression: захват реальных скриншотов браузера Selenium и сравнение с утверждёнными baseline через Pillow с диагностическими diff-артефактами.</w:t>
+        <w:t>Изучить скриншотное тестирование веб-приложений и интегрировать результаты тестирования с Allure reporting: выбрать публичный сайт, настроить Selenium, подключить Allure, выполнить скриншотные автотесты, собрать отчёт Allure и подготовить аналитический отчёт.</w:t>
+      </w:r>
+    </w:p>
+    <w:p>
+      <w:pPr>
+        <w:pStyle w:val="Heading1"/>
+      </w:pPr>
+      <w:r>
+        <w:rPr>
+          <w:rFonts w:ascii="Times New Roman" w:hAnsi="Times New Roman" w:eastAsia="Times New Roman"/>
+          <w:b/>
+          <w:sz w:val="28"/>
+        </w:rPr>
+        <w:t>2. Публичный сайт и обоснование</w:t>
+      </w:r>
+    </w:p>
+    <w:p>
+      <w:pPr>
+        <w:spacing w:after="120"/>
+      </w:pPr>
+      <w:r>
+        <w:rPr>
+          <w:rFonts w:ascii="Times New Roman" w:hAnsi="Times New Roman" w:eastAsia="Times New Roman"/>
+          <w:b w:val="0"/>
+          <w:sz w:val="24"/>
+        </w:rPr>
+        <w:t>Выбран https://www.saucedemo.com/ — публичное demo-приложение Swag Labs (login, каталог, dropdown сортировки, корзина).</w:t>
       </w:r>
     </w:p>
     <w:p>
@@ -148,7 +146,7 @@
           <w:b/>
           <w:sz w:val="24"/>
         </w:rPr>
-        <w:t>Презентация cloud.ithub.ru (КТ08) без авторизации недоступна; требования взяты из формулировки задания. Полное соответствие скрытым слайдам не утверждается.</w:t>
+        <w:t>Кандидат https://the-internet.herokuapp.com/ недоступен для Chrome automation на данной машине: после get() DOM остаётся пустым (challenge/bot script). Отклонение задокументировано; localhost не подменял требование публичного сайта.</w:t>
       </w:r>
     </w:p>
     <w:p>
@@ -161,137 +159,7 @@
           <w:b/>
           <w:sz w:val="28"/>
         </w:rPr>
-        <w:t>2. Теория visual regression</w:t>
-      </w:r>
-    </w:p>
-    <w:p>
-      <w:pPr>
-        <w:spacing w:after="120"/>
-      </w:pPr>
-      <w:r>
-        <w:rPr>
-          <w:rFonts w:ascii="Times New Roman" w:hAnsi="Times New Roman" w:eastAsia="Times New Roman"/>
-          <w:b w:val="0"/>
-          <w:sz w:val="24"/>
-        </w:rPr>
-        <w:t>Скриншотное сравнение выявляет нежелательные визуальные изменения UI (цвет, текст, сдвиг блоков, пропавшие элементы), которые могут пропустить селекторные тесты. Эталон (baseline) утверждается вручную; каждый прогон сравнивает новый снимок с эталоном попиксельно с допуском цвета и порогом доли изменённых пикселей.</w:t>
-      </w:r>
-    </w:p>
-    <w:p>
-      <w:pPr>
-        <w:pStyle w:val="Heading1"/>
-      </w:pPr>
-      <w:r>
-        <w:rPr>
-          <w:rFonts w:ascii="Times New Roman" w:hAnsi="Times New Roman" w:eastAsia="Times New Roman"/>
-          <w:b/>
-          <w:sz w:val="28"/>
-        </w:rPr>
-        <w:t>3. Реализация</w:t>
-      </w:r>
-    </w:p>
-    <w:p>
-      <w:pPr>
-        <w:spacing w:after="120"/>
-      </w:pPr>
-      <w:r>
-        <w:rPr>
-          <w:rFonts w:ascii="Times New Roman" w:hAnsi="Times New Roman" w:eastAsia="Times New Roman"/>
-          <w:b w:val="0"/>
-          <w:sz w:val="24"/>
-        </w:rPr>
-        <w:t>Selenium 4 Chrome фиксирует окно 1400×1000 и сохраняет PNG.</w:t>
-      </w:r>
-    </w:p>
-    <w:p>
-      <w:pPr>
-        <w:spacing w:after="120"/>
-      </w:pPr>
-      <w:r>
-        <w:rPr>
-          <w:rFonts w:ascii="Times New Roman" w:hAnsi="Times New Roman" w:eastAsia="Times New Roman"/>
-          <w:b w:val="0"/>
-          <w:sz w:val="24"/>
-        </w:rPr>
-        <w:t>Pillow (`selenium/visual/compare.py`): RGB-загрузка, запрет auto-resize, допуск color_tolerance=12, threshold match=0.75%, mask и красный overlay. Baseline при FAIL не перезаписывается.</w:t>
-      </w:r>
-    </w:p>
-    <w:p>
-      <w:pPr>
-        <w:spacing w:after="0"/>
-      </w:pPr>
-      <w:r>
-        <w:rPr>
-          <w:rFonts w:ascii="Consolas" w:hAnsi="Consolas" w:eastAsia="Consolas"/>
-          <w:b w:val="0"/>
-          <w:sz w:val="18"/>
-        </w:rPr>
-        <w:t>.\.venv\Scripts\python.exe selenium\visual\generate_kt08_baselines.py</w:t>
-      </w:r>
-    </w:p>
-    <w:p>
-      <w:pPr>
-        <w:spacing w:after="0"/>
-      </w:pPr>
-      <w:r>
-        <w:rPr>
-          <w:rFonts w:ascii="Consolas" w:hAnsi="Consolas" w:eastAsia="Consolas"/>
-          <w:b w:val="0"/>
-          <w:sz w:val="18"/>
-        </w:rPr>
-        <w:t>.\scripts\run_kt08.ps1</w:t>
-      </w:r>
-    </w:p>
-    <w:p>
-      <w:pPr>
-        <w:pStyle w:val="Heading1"/>
-      </w:pPr>
-      <w:r>
-        <w:rPr>
-          <w:rFonts w:ascii="Times New Roman" w:hAnsi="Times New Roman" w:eastAsia="Times New Roman"/>
-          <w:b/>
-          <w:sz w:val="28"/>
-        </w:rPr>
-        <w:t>4. Baseline</w:t>
-      </w:r>
-    </w:p>
-    <w:p>
-      <w:pPr>
-        <w:spacing w:after="120"/>
-      </w:pPr>
-      <w:r>
-        <w:rPr>
-          <w:rFonts w:ascii="Times New Roman" w:hAnsi="Times New Roman" w:eastAsia="Times New Roman"/>
-          <w:b w:val="0"/>
-          <w:sz w:val="24"/>
-        </w:rPr>
-        <w:t>Файл selenium/baselines/kt08/home_baseline.png получен реальным Chrome из home.html; размер изображения 1384×849; манифест baseline_manifest.json.</w:t>
-      </w:r>
-    </w:p>
-    <w:p>
-      <w:pPr>
-        <w:pStyle w:val="Heading1"/>
-      </w:pPr>
-      <w:r>
-        <w:rPr>
-          <w:rFonts w:ascii="Times New Roman" w:hAnsi="Times New Roman" w:eastAsia="Times New Roman"/>
-          <w:b/>
-          <w:sz w:val="28"/>
-        </w:rPr>
-        <w:t>5. Результаты прогона</w:t>
-      </w:r>
-    </w:p>
-    <w:p>
-      <w:pPr>
-        <w:spacing w:after="120"/>
-      </w:pPr>
-      <w:r>
-        <w:rPr>
-          <w:rFonts w:ascii="Times New Roman" w:hAnsi="Times New Roman" w:eastAsia="Times New Roman"/>
-          <w:b w:val="0"/>
-          <w:sz w:val="24"/>
-        </w:rPr>
-        <w:t>Диагностика: TC-08-01 PASS. Suite: 5 passed in 13.71s, exit 0.</w:t>
+        <w:t>3. Сценарии Selenium на публичном сайте</w:t>
       </w:r>
     </w:p>
     <w:tbl>
@@ -301,16 +169,14 @@
         <w:tblLook w:firstColumn="1" w:firstRow="1" w:lastColumn="0" w:lastRow="0" w:noHBand="0" w:noVBand="1" w:val="04A0"/>
       </w:tblPr>
       <w:tblGrid>
-        <w:gridCol w:w="1995"/>
-        <w:gridCol w:w="1995"/>
-        <w:gridCol w:w="1995"/>
-        <w:gridCol w:w="1995"/>
-        <w:gridCol w:w="1995"/>
+        <w:gridCol w:w="3324"/>
+        <w:gridCol w:w="3324"/>
+        <w:gridCol w:w="3324"/>
       </w:tblGrid>
       <w:tr>
         <w:tc>
           <w:tcPr>
-            <w:tcW w:type="dxa" w:w="1995"/>
+            <w:tcW w:type="dxa" w:w="3324"/>
           </w:tcPr>
           <w:p>
             <w:r>
@@ -320,7 +186,7 @@
         </w:tc>
         <w:tc>
           <w:tcPr>
-            <w:tcW w:type="dxa" w:w="1995"/>
+            <w:tcW w:type="dxa" w:w="3324"/>
           </w:tcPr>
           <w:p>
             <w:r>
@@ -330,27 +196,7 @@
         </w:tc>
         <w:tc>
           <w:tcPr>
-            <w:tcW w:type="dxa" w:w="1995"/>
-          </w:tcPr>
-          <w:p>
-            <w:r>
-              <w:t>Diff%</w:t>
-            </w:r>
-          </w:p>
-        </w:tc>
-        <w:tc>
-          <w:tcPr>
-            <w:tcW w:type="dxa" w:w="1995"/>
-          </w:tcPr>
-          <w:p>
-            <w:r>
-              <w:t>Changed px</w:t>
-            </w:r>
-          </w:p>
-        </w:tc>
-        <w:tc>
-          <w:tcPr>
-            <w:tcW w:type="dxa" w:w="1995"/>
+            <w:tcW w:type="dxa" w:w="3324"/>
           </w:tcPr>
           <w:p>
             <w:r>
@@ -362,47 +208,27 @@
       <w:tr>
         <w:tc>
           <w:tcPr>
-            <w:tcW w:type="dxa" w:w="1995"/>
+            <w:tcW w:type="dxa" w:w="3324"/>
           </w:tcPr>
           <w:p>
             <w:r>
-              <w:t>TC-08-01</w:t>
+              <w:t>TC-08-P01</w:t>
             </w:r>
           </w:p>
         </w:tc>
         <w:tc>
           <w:tcPr>
-            <w:tcW w:type="dxa" w:w="1995"/>
+            <w:tcW w:type="dxa" w:w="3324"/>
           </w:tcPr>
           <w:p>
             <w:r>
-              <w:t>match baseline</w:t>
+              <w:t>Login page / branding / form</w:t>
             </w:r>
           </w:p>
         </w:tc>
         <w:tc>
           <w:tcPr>
-            <w:tcW w:type="dxa" w:w="1995"/>
-          </w:tcPr>
-          <w:p>
-            <w:r>
-              <w:t>0.0000%</w:t>
-            </w:r>
-          </w:p>
-        </w:tc>
-        <w:tc>
-          <w:tcPr>
-            <w:tcW w:type="dxa" w:w="1995"/>
-          </w:tcPr>
-          <w:p>
-            <w:r>
-              <w:t>0</w:t>
-            </w:r>
-          </w:p>
-        </w:tc>
-        <w:tc>
-          <w:tcPr>
-            <w:tcW w:type="dxa" w:w="1995"/>
+            <w:tcW w:type="dxa" w:w="3324"/>
           </w:tcPr>
           <w:p>
             <w:r>
@@ -414,47 +240,27 @@
       <w:tr>
         <w:tc>
           <w:tcPr>
-            <w:tcW w:type="dxa" w:w="1995"/>
+            <w:tcW w:type="dxa" w:w="3324"/>
           </w:tcPr>
           <w:p>
             <w:r>
-              <w:t>TC-08-02</w:t>
+              <w:t>TC-08-P02</w:t>
             </w:r>
           </w:p>
         </w:tc>
         <w:tc>
           <w:tcPr>
-            <w:tcW w:type="dxa" w:w="1995"/>
+            <w:tcW w:type="dxa" w:w="3324"/>
           </w:tcPr>
           <w:p>
             <w:r>
-              <w:t>text/color change</w:t>
+              <w:t>Inventory after login</w:t>
             </w:r>
           </w:p>
         </w:tc>
         <w:tc>
           <w:tcPr>
-            <w:tcW w:type="dxa" w:w="1995"/>
-          </w:tcPr>
-          <w:p>
-            <w:r>
-              <w:t>1.1082%</w:t>
-            </w:r>
-          </w:p>
-        </w:tc>
-        <w:tc>
-          <w:tcPr>
-            <w:tcW w:type="dxa" w:w="1995"/>
-          </w:tcPr>
-          <w:p>
-            <w:r>
-              <w:t>13021</w:t>
-            </w:r>
-          </w:p>
-        </w:tc>
-        <w:tc>
-          <w:tcPr>
-            <w:tcW w:type="dxa" w:w="1995"/>
+            <w:tcW w:type="dxa" w:w="3324"/>
           </w:tcPr>
           <w:p>
             <w:r>
@@ -466,47 +272,27 @@
       <w:tr>
         <w:tc>
           <w:tcPr>
-            <w:tcW w:type="dxa" w:w="1995"/>
+            <w:tcW w:type="dxa" w:w="3324"/>
           </w:tcPr>
           <w:p>
             <w:r>
-              <w:t>TC-08-03</w:t>
+              <w:t>TC-08-P03</w:t>
             </w:r>
           </w:p>
         </w:tc>
         <w:tc>
           <w:tcPr>
-            <w:tcW w:type="dxa" w:w="1995"/>
+            <w:tcW w:type="dxa" w:w="3324"/>
           </w:tcPr>
           <w:p>
             <w:r>
-              <w:t>layout shift</w:t>
+              <w:t>Sort dropdown</w:t>
             </w:r>
           </w:p>
         </w:tc>
         <w:tc>
           <w:tcPr>
-            <w:tcW w:type="dxa" w:w="1995"/>
-          </w:tcPr>
-          <w:p>
-            <w:r>
-              <w:t>5.0647%</w:t>
-            </w:r>
-          </w:p>
-        </w:tc>
-        <w:tc>
-          <w:tcPr>
-            <w:tcW w:type="dxa" w:w="1995"/>
-          </w:tcPr>
-          <w:p>
-            <w:r>
-              <w:t>59511</w:t>
-            </w:r>
-          </w:p>
-        </w:tc>
-        <w:tc>
-          <w:tcPr>
-            <w:tcW w:type="dxa" w:w="1995"/>
+            <w:tcW w:type="dxa" w:w="3324"/>
           </w:tcPr>
           <w:p>
             <w:r>
@@ -518,99 +304,27 @@
       <w:tr>
         <w:tc>
           <w:tcPr>
-            <w:tcW w:type="dxa" w:w="1995"/>
+            <w:tcW w:type="dxa" w:w="3324"/>
           </w:tcPr>
           <w:p>
             <w:r>
-              <w:t>TC-08-04</w:t>
+              <w:t>TC-08-P04</w:t>
             </w:r>
           </w:p>
         </w:tc>
         <w:tc>
           <w:tcPr>
-            <w:tcW w:type="dxa" w:w="1995"/>
+            <w:tcW w:type="dxa" w:w="3324"/>
           </w:tcPr>
           <w:p>
             <w:r>
-              <w:t>significant diff</w:t>
+              <w:t>Add to cart / badge</w:t>
             </w:r>
           </w:p>
         </w:tc>
         <w:tc>
           <w:tcPr>
-            <w:tcW w:type="dxa" w:w="1995"/>
-          </w:tcPr>
-          <w:p>
-            <w:r>
-              <w:t>99.8457%</w:t>
-            </w:r>
-          </w:p>
-        </w:tc>
-        <w:tc>
-          <w:tcPr>
-            <w:tcW w:type="dxa" w:w="1995"/>
-          </w:tcPr>
-          <w:p>
-            <w:r>
-              <w:t>1173203</w:t>
-            </w:r>
-          </w:p>
-        </w:tc>
-        <w:tc>
-          <w:tcPr>
-            <w:tcW w:type="dxa" w:w="1995"/>
-          </w:tcPr>
-          <w:p>
-            <w:r>
-              <w:t>PASS</w:t>
-            </w:r>
-          </w:p>
-        </w:tc>
-      </w:tr>
-      <w:tr>
-        <w:tc>
-          <w:tcPr>
-            <w:tcW w:type="dxa" w:w="1995"/>
-          </w:tcPr>
-          <w:p>
-            <w:r>
-              <w:t>TC-08-05</w:t>
-            </w:r>
-          </w:p>
-        </w:tc>
-        <w:tc>
-          <w:tcPr>
-            <w:tcW w:type="dxa" w:w="1995"/>
-          </w:tcPr>
-          <w:p>
-            <w:r>
-              <w:t>dimension mismatch</w:t>
-            </w:r>
-          </w:p>
-        </w:tc>
-        <w:tc>
-          <w:tcPr>
-            <w:tcW w:type="dxa" w:w="1995"/>
-          </w:tcPr>
-          <w:p>
-            <w:r>
-              <w:t>n/a</w:t>
-            </w:r>
-          </w:p>
-        </w:tc>
-        <w:tc>
-          <w:tcPr>
-            <w:tcW w:type="dxa" w:w="1995"/>
-          </w:tcPr>
-          <w:p>
-            <w:r>
-              <w:t>—</w:t>
-            </w:r>
-          </w:p>
-        </w:tc>
-        <w:tc>
-          <w:tcPr>
-            <w:tcW w:type="dxa" w:w="1995"/>
+            <w:tcW w:type="dxa" w:w="3324"/>
           </w:tcPr>
           <w:p>
             <w:r>
@@ -634,15 +348,15 @@
     </w:p>
     <w:p>
       <w:pPr>
-        <w:spacing w:after="0"/>
+        <w:spacing w:after="120"/>
       </w:pPr>
       <w:r>
         <w:rPr>
-          <w:rFonts w:ascii="Consolas" w:hAnsi="Consolas" w:eastAsia="Consolas"/>
+          <w:rFonts w:ascii="Times New Roman" w:hAnsi="Times New Roman" w:eastAsia="Times New Roman"/>
           <w:b w:val="0"/>
-          <w:sz w:val="18"/>
+          <w:sz w:val="24"/>
         </w:rPr>
-        <w:t>============================= 5 passed in 13.71s ==============================</w:t>
+        <w:t>Файл: selenium/tests/test_kt08_public_allure.py. Viewport 1400×1000, pageLoadStrategy=eager, явные ожидания без Sleep.</w:t>
       </w:r>
     </w:p>
     <w:p>
@@ -655,7 +369,7 @@
           <w:b/>
           <w:sz w:val="28"/>
         </w:rPr>
-        <w:t>6. Метрики</w:t>
+        <w:t>4. Архитектура Allure</w:t>
       </w:r>
     </w:p>
     <w:p>
@@ -668,7 +382,33 @@
           <w:b w:val="0"/>
           <w:sz w:val="24"/>
         </w:rPr>
-        <w:t>changed_pixels — число пикселей, где max(|ΔR|,|ΔG|,|ΔB|) &gt; tolerance. diff_percent = changed_pixels / (width*height) * 100. DIMENSION_MISMATCH фиксируется отдельно без масштабирования (пример: 1384×849 vs 884×549).</w:t>
+        <w:t>allure-pytest 2.16.2 пишет результаты в selenium/artifacts/kt08/allure-results/. Allure CLI 2.37.0 (Java 21) генерирует HTML: allure generate … -o allure-report. В тестах: @allure.title/description/severity/step + allure.attach.file(PNG).</w:t>
+      </w:r>
+    </w:p>
+    <w:p>
+      <w:pPr>
+        <w:spacing w:after="0"/>
+      </w:pPr>
+      <w:r>
+        <w:rPr>
+          <w:rFonts w:ascii="Consolas" w:hAnsi="Consolas" w:eastAsia="Consolas"/>
+          <w:b w:val="0"/>
+          <w:sz w:val="18"/>
+        </w:rPr>
+        <w:t>.\scripts\run_kt08.ps1 -Mode Full</w:t>
+      </w:r>
+    </w:p>
+    <w:p>
+      <w:pPr>
+        <w:spacing w:after="0"/>
+      </w:pPr>
+      <w:r>
+        <w:rPr>
+          <w:rFonts w:ascii="Consolas" w:hAnsi="Consolas" w:eastAsia="Consolas"/>
+          <w:b w:val="0"/>
+          <w:sz w:val="18"/>
+        </w:rPr>
+        <w:t># → allure-results + allure-report\index.html</w:t>
       </w:r>
     </w:p>
     <w:p>
@@ -681,14 +421,14 @@
           <w:b/>
           <w:sz w:val="28"/>
         </w:rPr>
-        <w:t>7. Скриншоты и diff</w:t>
+        <w:t>5. Скриншоты публичного сайта</w:t>
       </w:r>
     </w:p>
     <w:p>
       <w:r>
         <w:drawing>
           <wp:inline xmlns:a="http://schemas.openxmlformats.org/drawingml/2006/main" xmlns:pic="http://schemas.openxmlformats.org/drawingml/2006/picture">
-            <wp:extent cx="4320000" cy="2650058"/>
+            <wp:extent cx="3960000" cy="2429220"/>
             <wp:docPr id="1" name="Picture 1"/>
             <wp:cNvGraphicFramePr>
               <a:graphicFrameLocks noChangeAspect="1"/>
@@ -697,7 +437,7 @@
               <a:graphicData uri="http://schemas.openxmlformats.org/drawingml/2006/picture">
                 <pic:pic>
                   <pic:nvPicPr>
-                    <pic:cNvPr id="0" name="home_baseline.png"/>
+                    <pic:cNvPr id="0" name="public_01_login_page.png"/>
                     <pic:cNvPicPr/>
                   </pic:nvPicPr>
                   <pic:blipFill>
@@ -709,7 +449,7 @@
                   <pic:spPr>
                     <a:xfrm>
                       <a:off x="0" y="0"/>
-                      <a:ext cx="4320000" cy="2650058"/>
+                      <a:ext cx="3960000" cy="2429220"/>
                     </a:xfrm>
                     <a:prstGeom prst="rect"/>
                   </pic:spPr>
@@ -730,14 +470,14 @@
           <w:b w:val="0"/>
           <w:sz w:val="22"/>
         </w:rPr>
-        <w:t>Рисунок 1 — Approved baseline (home_baseline.png)</w:t>
+        <w:t>Рис. P1 — Login page</w:t>
       </w:r>
     </w:p>
     <w:p>
       <w:r>
         <w:drawing>
           <wp:inline xmlns:a="http://schemas.openxmlformats.org/drawingml/2006/main" xmlns:pic="http://schemas.openxmlformats.org/drawingml/2006/picture">
-            <wp:extent cx="4320000" cy="2650058"/>
+            <wp:extent cx="3960000" cy="2429220"/>
             <wp:docPr id="2" name="Picture 2"/>
             <wp:cNvGraphicFramePr>
               <a:graphicFrameLocks noChangeAspect="1"/>
@@ -746,11 +486,11 @@
               <a:graphicData uri="http://schemas.openxmlformats.org/drawingml/2006/picture">
                 <pic:pic>
                   <pic:nvPicPr>
-                    <pic:cNvPr id="0" name="home_baseline.png"/>
+                    <pic:cNvPr id="0" name="public_02_inventory.png"/>
                     <pic:cNvPicPr/>
                   </pic:nvPicPr>
                   <pic:blipFill>
-                    <a:blip r:embed="rId9"/>
+                    <a:blip r:embed="rId10"/>
                     <a:stretch>
                       <a:fillRect/>
                     </a:stretch>
@@ -758,7 +498,7 @@
                   <pic:spPr>
                     <a:xfrm>
                       <a:off x="0" y="0"/>
-                      <a:ext cx="4320000" cy="2650058"/>
+                      <a:ext cx="3960000" cy="2429220"/>
                     </a:xfrm>
                     <a:prstGeom prst="rect"/>
                   </pic:spPr>
@@ -779,14 +519,14 @@
           <w:b w:val="0"/>
           <w:sz w:val="22"/>
         </w:rPr>
-        <w:t>Рисунок 2 — Actual match screenshot</w:t>
+        <w:t>Рис. P2 — Inventory / Products</w:t>
       </w:r>
     </w:p>
     <w:p>
       <w:r>
         <w:drawing>
           <wp:inline xmlns:a="http://schemas.openxmlformats.org/drawingml/2006/main" xmlns:pic="http://schemas.openxmlformats.org/drawingml/2006/picture">
-            <wp:extent cx="4320000" cy="2650058"/>
+            <wp:extent cx="3960000" cy="2429220"/>
             <wp:docPr id="3" name="Picture 3"/>
             <wp:cNvGraphicFramePr>
               <a:graphicFrameLocks noChangeAspect="1"/>
@@ -795,11 +535,11 @@
               <a:graphicData uri="http://schemas.openxmlformats.org/drawingml/2006/picture">
                 <pic:pic>
                   <pic:nvPicPr>
-                    <pic:cNvPr id="0" name="02_text_color_actual.png"/>
+                    <pic:cNvPr id="0" name="public_03_sort_dropdown.png"/>
                     <pic:cNvPicPr/>
                   </pic:nvPicPr>
                   <pic:blipFill>
-                    <a:blip r:embed="rId10"/>
+                    <a:blip r:embed="rId11"/>
                     <a:stretch>
                       <a:fillRect/>
                     </a:stretch>
@@ -807,7 +547,7 @@
                   <pic:spPr>
                     <a:xfrm>
                       <a:off x="0" y="0"/>
-                      <a:ext cx="4320000" cy="2650058"/>
+                      <a:ext cx="3960000" cy="2429220"/>
                     </a:xfrm>
                     <a:prstGeom prst="rect"/>
                   </pic:spPr>
@@ -828,14 +568,14 @@
           <w:b w:val="0"/>
           <w:sz w:val="22"/>
         </w:rPr>
-        <w:t>Рисунок 3 — Text/color change actual</w:t>
+        <w:t>Рис. P3 — Sort dropdown (Z to A)</w:t>
       </w:r>
     </w:p>
     <w:p>
       <w:r>
         <w:drawing>
           <wp:inline xmlns:a="http://schemas.openxmlformats.org/drawingml/2006/main" xmlns:pic="http://schemas.openxmlformats.org/drawingml/2006/picture">
-            <wp:extent cx="4320000" cy="2650058"/>
+            <wp:extent cx="3960000" cy="2429220"/>
             <wp:docPr id="4" name="Picture 4"/>
             <wp:cNvGraphicFramePr>
               <a:graphicFrameLocks noChangeAspect="1"/>
@@ -844,11 +584,11 @@
               <a:graphicData uri="http://schemas.openxmlformats.org/drawingml/2006/picture">
                 <pic:pic>
                   <pic:nvPicPr>
-                    <pic:cNvPr id="0" name="02_text_color_overlay.png"/>
+                    <pic:cNvPr id="0" name="public_04_add_to_cart.png"/>
                     <pic:cNvPicPr/>
                   </pic:nvPicPr>
                   <pic:blipFill>
-                    <a:blip r:embed="rId11"/>
+                    <a:blip r:embed="rId12"/>
                     <a:stretch>
                       <a:fillRect/>
                     </a:stretch>
@@ -856,7 +596,7 @@
                   <pic:spPr>
                     <a:xfrm>
                       <a:off x="0" y="0"/>
-                      <a:ext cx="4320000" cy="2650058"/>
+                      <a:ext cx="3960000" cy="2429220"/>
                     </a:xfrm>
                     <a:prstGeom prst="rect"/>
                   </pic:spPr>
@@ -877,14 +617,40 @@
           <w:b w:val="0"/>
           <w:sz w:val="22"/>
         </w:rPr>
-        <w:t>Рисунок 4 — Overlay text/color diffs</w:t>
+        <w:t>Рис. P4 — Add to cart / badge=1</w:t>
+      </w:r>
+    </w:p>
+    <w:p>
+      <w:pPr>
+        <w:pStyle w:val="Heading1"/>
+      </w:pPr>
+      <w:r>
+        <w:rPr>
+          <w:rFonts w:ascii="Times New Roman" w:hAnsi="Times New Roman" w:eastAsia="Times New Roman"/>
+          <w:b/>
+          <w:sz w:val="28"/>
+        </w:rPr>
+        <w:t>6. Allure attachments и HTML-отчёт</w:t>
+      </w:r>
+    </w:p>
+    <w:p>
+      <w:pPr>
+        <w:spacing w:after="120"/>
+      </w:pPr>
+      <w:r>
+        <w:rPr>
+          <w:rFonts w:ascii="Times New Roman" w:hAnsi="Times New Roman" w:eastAsia="Times New Roman"/>
+          <w:b w:val="0"/>
+          <w:sz w:val="24"/>
+        </w:rPr>
+        <w:t>В allure-results: 9 test result JSON; PNG/text attachments во вложенных steps (проверено парсером). HTML-отчёт открывается (title «Allure Report»).</w:t>
       </w:r>
     </w:p>
     <w:p>
       <w:r>
         <w:drawing>
           <wp:inline xmlns:a="http://schemas.openxmlformats.org/drawingml/2006/main" xmlns:pic="http://schemas.openxmlformats.org/drawingml/2006/picture">
-            <wp:extent cx="4320000" cy="2650058"/>
+            <wp:extent cx="3960000" cy="2429220"/>
             <wp:docPr id="5" name="Picture 5"/>
             <wp:cNvGraphicFramePr>
               <a:graphicFrameLocks noChangeAspect="1"/>
@@ -893,11 +659,11 @@
               <a:graphicData uri="http://schemas.openxmlformats.org/drawingml/2006/picture">
                 <pic:pic>
                   <pic:nvPicPr>
-                    <pic:cNvPr id="0" name="03_layout_shift_actual.png"/>
+                    <pic:cNvPr id="0" name="allure_01_overview.png"/>
                     <pic:cNvPicPr/>
                   </pic:nvPicPr>
                   <pic:blipFill>
-                    <a:blip r:embed="rId12"/>
+                    <a:blip r:embed="rId13"/>
                     <a:stretch>
                       <a:fillRect/>
                     </a:stretch>
@@ -905,7 +671,7 @@
                   <pic:spPr>
                     <a:xfrm>
                       <a:off x="0" y="0"/>
-                      <a:ext cx="4320000" cy="2650058"/>
+                      <a:ext cx="3960000" cy="2429220"/>
                     </a:xfrm>
                     <a:prstGeom prst="rect"/>
                   </pic:spPr>
@@ -926,14 +692,14 @@
           <w:b w:val="0"/>
           <w:sz w:val="22"/>
         </w:rPr>
-        <w:t>Рисунок 5 — Layout shift actual</w:t>
+        <w:t>Рис. A1 — Allure overview</w:t>
       </w:r>
     </w:p>
     <w:p>
       <w:r>
         <w:drawing>
           <wp:inline xmlns:a="http://schemas.openxmlformats.org/drawingml/2006/main" xmlns:pic="http://schemas.openxmlformats.org/drawingml/2006/picture">
-            <wp:extent cx="4320000" cy="2650058"/>
+            <wp:extent cx="3960000" cy="2429220"/>
             <wp:docPr id="6" name="Picture 6"/>
             <wp:cNvGraphicFramePr>
               <a:graphicFrameLocks noChangeAspect="1"/>
@@ -942,11 +708,11 @@
               <a:graphicData uri="http://schemas.openxmlformats.org/drawingml/2006/picture">
                 <pic:pic>
                   <pic:nvPicPr>
-                    <pic:cNvPr id="0" name="03_layout_shift_overlay.png"/>
+                    <pic:cNvPr id="0" name="allure_02_suites.png"/>
                     <pic:cNvPicPr/>
                   </pic:nvPicPr>
                   <pic:blipFill>
-                    <a:blip r:embed="rId13"/>
+                    <a:blip r:embed="rId14"/>
                     <a:stretch>
                       <a:fillRect/>
                     </a:stretch>
@@ -954,7 +720,7 @@
                   <pic:spPr>
                     <a:xfrm>
                       <a:off x="0" y="0"/>
-                      <a:ext cx="4320000" cy="2650058"/>
+                      <a:ext cx="3960000" cy="2429220"/>
                     </a:xfrm>
                     <a:prstGeom prst="rect"/>
                   </pic:spPr>
@@ -975,14 +741,421 @@
           <w:b w:val="0"/>
           <w:sz w:val="22"/>
         </w:rPr>
-        <w:t>Рисунок 6 — Overlay layout shift</w:t>
+        <w:t>Рис. A2 — Allure suites/navigation</w:t>
+      </w:r>
+    </w:p>
+    <w:p>
+      <w:pPr>
+        <w:pStyle w:val="Heading1"/>
+      </w:pPr>
+      <w:r>
+        <w:rPr>
+          <w:rFonts w:ascii="Times New Roman" w:hAnsi="Times New Roman" w:eastAsia="Times New Roman"/>
+          <w:b/>
+          <w:sz w:val="28"/>
+        </w:rPr>
+        <w:t>7. Результаты выполнения</w:t>
+      </w:r>
+    </w:p>
+    <w:p>
+      <w:pPr>
+        <w:spacing w:after="120"/>
+      </w:pPr>
+      <w:r>
+        <w:rPr>
+          <w:rFonts w:ascii="Times New Roman" w:hAnsi="Times New Roman" w:eastAsia="Times New Roman"/>
+          <w:b w:val="0"/>
+          <w:sz w:val="24"/>
+        </w:rPr>
+        <w:t>DiagnosticPublic: 1 passed in 3.84s.</w:t>
+      </w:r>
+    </w:p>
+    <w:p>
+      <w:pPr>
+        <w:spacing w:after="120"/>
+      </w:pPr>
+      <w:r>
+        <w:rPr>
+          <w:rFonts w:ascii="Times New Roman" w:hAnsi="Times New Roman" w:eastAsia="Times New Roman"/>
+          <w:b w:val="0"/>
+          <w:sz w:val="24"/>
+        </w:rPr>
+        <w:t>Public only: 4 passed in 21.27s.</w:t>
+      </w:r>
+    </w:p>
+    <w:p>
+      <w:pPr>
+        <w:spacing w:after="0"/>
+      </w:pPr>
+      <w:r>
+        <w:rPr>
+          <w:rFonts w:ascii="Consolas" w:hAnsi="Consolas" w:eastAsia="Consolas"/>
+          <w:b w:val="0"/>
+          <w:sz w:val="18"/>
+        </w:rPr>
+        <w:t>============================= 9 passed in 34.64s ==============================</w:t>
+      </w:r>
+    </w:p>
+    <w:p>
+      <w:pPr>
+        <w:spacing w:after="120"/>
+      </w:pPr>
+      <w:r>
+        <w:rPr>
+          <w:rFonts w:ascii="Times New Roman" w:hAnsi="Times New Roman" w:eastAsia="Times New Roman"/>
+          <w:b w:val="0"/>
+          <w:sz w:val="24"/>
+        </w:rPr>
+        <w:t>Full suite (Pillow + Public), 2026-10-10. Лог: pytest_kt08_20261010_144813.log.</w:t>
+      </w:r>
+    </w:p>
+    <w:p>
+      <w:pPr>
+        <w:pStyle w:val="Heading1"/>
+      </w:pPr>
+      <w:r>
+        <w:rPr>
+          <w:rFonts w:ascii="Times New Roman" w:hAnsi="Times New Roman" w:eastAsia="Times New Roman"/>
+          <w:b/>
+          <w:sz w:val="28"/>
+        </w:rPr>
+        <w:t>8. Анализ UI Sauce Demo</w:t>
+      </w:r>
+    </w:p>
+    <w:p>
+      <w:pPr>
+        <w:spacing w:after="120"/>
+      </w:pPr>
+      <w:r>
+        <w:rPr>
+          <w:rFonts w:ascii="Times New Roman" w:hAnsi="Times New Roman" w:eastAsia="Times New Roman"/>
+          <w:b w:val="0"/>
+          <w:sz w:val="24"/>
+        </w:rPr>
+        <w:t>Login page: явные поля user-name/password и подсказка accepted usernames — удобно для обучения. Inventory: стабильные data-test атрибуты; сортировка через native &lt;select&gt;. Корзина обновляет badge. Наблюдение: после select React перерисовывает DOM (нужен re-find); the-internet.herokuapp.com непригоден под automation здесь.</w:t>
+      </w:r>
+    </w:p>
+    <w:p>
+      <w:pPr>
+        <w:spacing w:after="120"/>
+      </w:pPr>
+      <w:r>
+        <w:rPr>
+          <w:rFonts w:ascii="Times New Roman" w:hAnsi="Times New Roman" w:eastAsia="Times New Roman"/>
+          <w:b w:val="0"/>
+          <w:sz w:val="24"/>
+        </w:rPr>
+        <w:t>Рекомендации: для скриншотных тестов предпочитать сайты без bot-challenge; фиксировать viewport; крепить PNG в Allure steps, а не только в файловую систему.</w:t>
+      </w:r>
+    </w:p>
+    <w:p>
+      <w:pPr>
+        <w:pStyle w:val="Heading1"/>
+      </w:pPr>
+      <w:r>
+        <w:rPr>
+          <w:rFonts w:ascii="Times New Roman" w:hAnsi="Times New Roman" w:eastAsia="Times New Roman"/>
+          <w:b/>
+          <w:sz w:val="28"/>
+        </w:rPr>
+        <w:t>9. Сохранённый контур Pillow (исторический)</w:t>
+      </w:r>
+    </w:p>
+    <w:p>
+      <w:pPr>
+        <w:spacing w:after="120"/>
+      </w:pPr>
+      <w:r>
+        <w:rPr>
+          <w:rFonts w:ascii="Times New Roman" w:hAnsi="Times New Roman" w:eastAsia="Times New Roman"/>
+          <w:b w:val="0"/>
+          <w:sz w:val="24"/>
+        </w:rPr>
+        <w:t>Локальные HTML-фикстуры + compare.py. Исторический прогон: 5 passed in 13.71s (2026-10-09). В remediation Pillow-тесты сохранены и прошли в Full suite; diff/overlay также аттачатся в Allure.</w:t>
+      </w:r>
+    </w:p>
+    <w:tbl>
+      <w:tblPr>
+        <w:tblStyle w:val="TableGrid"/>
+        <w:tblW w:type="auto" w:w="0"/>
+        <w:tblLook w:firstColumn="1" w:firstRow="1" w:lastColumn="0" w:lastRow="0" w:noHBand="0" w:noVBand="1" w:val="04A0"/>
+      </w:tblPr>
+      <w:tblGrid>
+        <w:gridCol w:w="2493"/>
+        <w:gridCol w:w="2493"/>
+        <w:gridCol w:w="2493"/>
+        <w:gridCol w:w="2493"/>
+      </w:tblGrid>
+      <w:tr>
+        <w:tc>
+          <w:tcPr>
+            <w:tcW w:type="dxa" w:w="2493"/>
+          </w:tcPr>
+          <w:p>
+            <w:r>
+              <w:t>ID</w:t>
+            </w:r>
+          </w:p>
+        </w:tc>
+        <w:tc>
+          <w:tcPr>
+            <w:tcW w:type="dxa" w:w="2493"/>
+          </w:tcPr>
+          <w:p>
+            <w:r>
+              <w:t>Сценарий</w:t>
+            </w:r>
+          </w:p>
+        </w:tc>
+        <w:tc>
+          <w:tcPr>
+            <w:tcW w:type="dxa" w:w="2493"/>
+          </w:tcPr>
+          <w:p>
+            <w:r>
+              <w:t>Diff%</w:t>
+            </w:r>
+          </w:p>
+        </w:tc>
+        <w:tc>
+          <w:tcPr>
+            <w:tcW w:type="dxa" w:w="2493"/>
+          </w:tcPr>
+          <w:p>
+            <w:r>
+              <w:t>Статус</w:t>
+            </w:r>
+          </w:p>
+        </w:tc>
+      </w:tr>
+      <w:tr>
+        <w:tc>
+          <w:tcPr>
+            <w:tcW w:type="dxa" w:w="2493"/>
+          </w:tcPr>
+          <w:p>
+            <w:r>
+              <w:t>TC-08-01</w:t>
+            </w:r>
+          </w:p>
+        </w:tc>
+        <w:tc>
+          <w:tcPr>
+            <w:tcW w:type="dxa" w:w="2493"/>
+          </w:tcPr>
+          <w:p>
+            <w:r>
+              <w:t>match baseline</w:t>
+            </w:r>
+          </w:p>
+        </w:tc>
+        <w:tc>
+          <w:tcPr>
+            <w:tcW w:type="dxa" w:w="2493"/>
+          </w:tcPr>
+          <w:p>
+            <w:r>
+              <w:t>0.0000%</w:t>
+            </w:r>
+          </w:p>
+        </w:tc>
+        <w:tc>
+          <w:tcPr>
+            <w:tcW w:type="dxa" w:w="2493"/>
+          </w:tcPr>
+          <w:p>
+            <w:r>
+              <w:t>PASS</w:t>
+            </w:r>
+          </w:p>
+        </w:tc>
+      </w:tr>
+      <w:tr>
+        <w:tc>
+          <w:tcPr>
+            <w:tcW w:type="dxa" w:w="2493"/>
+          </w:tcPr>
+          <w:p>
+            <w:r>
+              <w:t>TC-08-02</w:t>
+            </w:r>
+          </w:p>
+        </w:tc>
+        <w:tc>
+          <w:tcPr>
+            <w:tcW w:type="dxa" w:w="2493"/>
+          </w:tcPr>
+          <w:p>
+            <w:r>
+              <w:t>text/color change</w:t>
+            </w:r>
+          </w:p>
+        </w:tc>
+        <w:tc>
+          <w:tcPr>
+            <w:tcW w:type="dxa" w:w="2493"/>
+          </w:tcPr>
+          <w:p>
+            <w:r>
+              <w:t>1.1082%</w:t>
+            </w:r>
+          </w:p>
+        </w:tc>
+        <w:tc>
+          <w:tcPr>
+            <w:tcW w:type="dxa" w:w="2493"/>
+          </w:tcPr>
+          <w:p>
+            <w:r>
+              <w:t>PASS</w:t>
+            </w:r>
+          </w:p>
+        </w:tc>
+      </w:tr>
+      <w:tr>
+        <w:tc>
+          <w:tcPr>
+            <w:tcW w:type="dxa" w:w="2493"/>
+          </w:tcPr>
+          <w:p>
+            <w:r>
+              <w:t>TC-08-03</w:t>
+            </w:r>
+          </w:p>
+        </w:tc>
+        <w:tc>
+          <w:tcPr>
+            <w:tcW w:type="dxa" w:w="2493"/>
+          </w:tcPr>
+          <w:p>
+            <w:r>
+              <w:t>layout shift</w:t>
+            </w:r>
+          </w:p>
+        </w:tc>
+        <w:tc>
+          <w:tcPr>
+            <w:tcW w:type="dxa" w:w="2493"/>
+          </w:tcPr>
+          <w:p>
+            <w:r>
+              <w:t>5.0647%</w:t>
+            </w:r>
+          </w:p>
+        </w:tc>
+        <w:tc>
+          <w:tcPr>
+            <w:tcW w:type="dxa" w:w="2493"/>
+          </w:tcPr>
+          <w:p>
+            <w:r>
+              <w:t>PASS</w:t>
+            </w:r>
+          </w:p>
+        </w:tc>
+      </w:tr>
+      <w:tr>
+        <w:tc>
+          <w:tcPr>
+            <w:tcW w:type="dxa" w:w="2493"/>
+          </w:tcPr>
+          <w:p>
+            <w:r>
+              <w:t>TC-08-04</w:t>
+            </w:r>
+          </w:p>
+        </w:tc>
+        <w:tc>
+          <w:tcPr>
+            <w:tcW w:type="dxa" w:w="2493"/>
+          </w:tcPr>
+          <w:p>
+            <w:r>
+              <w:t>significant diff</w:t>
+            </w:r>
+          </w:p>
+        </w:tc>
+        <w:tc>
+          <w:tcPr>
+            <w:tcW w:type="dxa" w:w="2493"/>
+          </w:tcPr>
+          <w:p>
+            <w:r>
+              <w:t>99.8457%</w:t>
+            </w:r>
+          </w:p>
+        </w:tc>
+        <w:tc>
+          <w:tcPr>
+            <w:tcW w:type="dxa" w:w="2493"/>
+          </w:tcPr>
+          <w:p>
+            <w:r>
+              <w:t>PASS</w:t>
+            </w:r>
+          </w:p>
+        </w:tc>
+      </w:tr>
+      <w:tr>
+        <w:tc>
+          <w:tcPr>
+            <w:tcW w:type="dxa" w:w="2493"/>
+          </w:tcPr>
+          <w:p>
+            <w:r>
+              <w:t>TC-08-05</w:t>
+            </w:r>
+          </w:p>
+        </w:tc>
+        <w:tc>
+          <w:tcPr>
+            <w:tcW w:type="dxa" w:w="2493"/>
+          </w:tcPr>
+          <w:p>
+            <w:r>
+              <w:t>dimension mismatch</w:t>
+            </w:r>
+          </w:p>
+        </w:tc>
+        <w:tc>
+          <w:tcPr>
+            <w:tcW w:type="dxa" w:w="2493"/>
+          </w:tcPr>
+          <w:p>
+            <w:r>
+              <w:t>n/a</w:t>
+            </w:r>
+          </w:p>
+        </w:tc>
+        <w:tc>
+          <w:tcPr>
+            <w:tcW w:type="dxa" w:w="2493"/>
+          </w:tcPr>
+          <w:p>
+            <w:r>
+              <w:t>PASS</w:t>
+            </w:r>
+          </w:p>
+        </w:tc>
+      </w:tr>
+    </w:tbl>
+    <w:p>
+      <w:pPr>
+        <w:spacing w:after="120"/>
+      </w:pPr>
+      <w:r>
+        <w:rPr>
+          <w:rFonts w:ascii="Times New Roman" w:hAnsi="Times New Roman" w:eastAsia="Times New Roman"/>
+          <w:b w:val="0"/>
+          <w:sz w:val="24"/>
+        </w:rPr>
       </w:r>
     </w:p>
     <w:p>
       <w:r>
         <w:drawing>
           <wp:inline xmlns:a="http://schemas.openxmlformats.org/drawingml/2006/main" xmlns:pic="http://schemas.openxmlformats.org/drawingml/2006/picture">
-            <wp:extent cx="4320000" cy="2650058"/>
+            <wp:extent cx="3240000" cy="1987543"/>
             <wp:docPr id="7" name="Picture 7"/>
             <wp:cNvGraphicFramePr>
               <a:graphicFrameLocks noChangeAspect="1"/>
@@ -991,11 +1164,11 @@
               <a:graphicData uri="http://schemas.openxmlformats.org/drawingml/2006/picture">
                 <pic:pic>
                   <pic:nvPicPr>
-                    <pic:cNvPr id="0" name="04_significant_actual.png"/>
+                    <pic:cNvPr id="0" name="home_baseline.png"/>
                     <pic:cNvPicPr/>
                   </pic:nvPicPr>
                   <pic:blipFill>
-                    <a:blip r:embed="rId14"/>
+                    <a:blip r:embed="rId15"/>
                     <a:stretch>
                       <a:fillRect/>
                     </a:stretch>
@@ -1003,7 +1176,7 @@
                   <pic:spPr>
                     <a:xfrm>
                       <a:off x="0" y="0"/>
-                      <a:ext cx="4320000" cy="2650058"/>
+                      <a:ext cx="3240000" cy="1987543"/>
                     </a:xfrm>
                     <a:prstGeom prst="rect"/>
                   </pic:spPr>
@@ -1024,14 +1197,14 @@
           <w:b w:val="0"/>
           <w:sz w:val="22"/>
         </w:rPr>
-        <w:t>Рисунок 7 — Significant change actual</w:t>
+        <w:t>Рис. L1 — Approved baseline</w:t>
       </w:r>
     </w:p>
     <w:p>
       <w:r>
         <w:drawing>
           <wp:inline xmlns:a="http://schemas.openxmlformats.org/drawingml/2006/main" xmlns:pic="http://schemas.openxmlformats.org/drawingml/2006/picture">
-            <wp:extent cx="4320000" cy="2650058"/>
+            <wp:extent cx="3240000" cy="1987543"/>
             <wp:docPr id="8" name="Picture 8"/>
             <wp:cNvGraphicFramePr>
               <a:graphicFrameLocks noChangeAspect="1"/>
@@ -1040,7 +1213,7 @@
               <a:graphicData uri="http://schemas.openxmlformats.org/drawingml/2006/picture">
                 <pic:pic>
                   <pic:nvPicPr>
-                    <pic:cNvPr id="0" name="04_significant_overlay.png"/>
+                    <pic:cNvPr id="0" name="home_baseline.png"/>
                     <pic:cNvPicPr/>
                   </pic:nvPicPr>
                   <pic:blipFill>
@@ -1052,7 +1225,7 @@
                   <pic:spPr>
                     <a:xfrm>
                       <a:off x="0" y="0"/>
-                      <a:ext cx="4320000" cy="2650058"/>
+                      <a:ext cx="3240000" cy="1987543"/>
                     </a:xfrm>
                     <a:prstGeom prst="rect"/>
                   </pic:spPr>
@@ -1073,14 +1246,14 @@
           <w:b w:val="0"/>
           <w:sz w:val="22"/>
         </w:rPr>
-        <w:t>Рисунок 8 — Overlay significant diffs</w:t>
+        <w:t>Рис. L2 — Actual match</w:t>
       </w:r>
     </w:p>
     <w:p>
       <w:r>
         <w:drawing>
           <wp:inline xmlns:a="http://schemas.openxmlformats.org/drawingml/2006/main" xmlns:pic="http://schemas.openxmlformats.org/drawingml/2006/picture">
-            <wp:extent cx="4320000" cy="2682896"/>
+            <wp:extent cx="3240000" cy="1987543"/>
             <wp:docPr id="9" name="Picture 9"/>
             <wp:cNvGraphicFramePr>
               <a:graphicFrameLocks noChangeAspect="1"/>
@@ -1089,7 +1262,7 @@
               <a:graphicData uri="http://schemas.openxmlformats.org/drawingml/2006/picture">
                 <pic:pic>
                   <pic:nvPicPr>
-                    <pic:cNvPr id="0" name="05_dimension_mismatch_actual.png"/>
+                    <pic:cNvPr id="0" name="02_text_color_overlay.png"/>
                     <pic:cNvPicPr/>
                   </pic:nvPicPr>
                   <pic:blipFill>
@@ -1101,7 +1274,7 @@
                   <pic:spPr>
                     <a:xfrm>
                       <a:off x="0" y="0"/>
-                      <a:ext cx="4320000" cy="2682896"/>
+                      <a:ext cx="3240000" cy="1987543"/>
                     </a:xfrm>
                     <a:prstGeom prst="rect"/>
                   </pic:spPr>
@@ -1122,7 +1295,7 @@
           <w:b w:val="0"/>
           <w:sz w:val="22"/>
         </w:rPr>
-        <w:t>Рисунок 9 — Smaller viewport (dimension mismatch)</w:t>
+        <w:t>Рис. L3 — Overlay text/color</w:t>
       </w:r>
     </w:p>
     <w:p>
@@ -1135,7 +1308,381 @@
           <w:b/>
           <w:sz w:val="28"/>
         </w:rPr>
-        <w:t>8. Плюсы и ограничения</w:t>
+        <w:t>10. Compliance checklist (7 требований)</w:t>
+      </w:r>
+    </w:p>
+    <w:tbl>
+      <w:tblPr>
+        <w:tblStyle w:val="TableGrid"/>
+        <w:tblW w:type="auto" w:w="0"/>
+        <w:tblLook w:firstColumn="1" w:firstRow="1" w:lastColumn="0" w:lastRow="0" w:noHBand="0" w:noVBand="1" w:val="04A0"/>
+      </w:tblPr>
+      <w:tblGrid>
+        <w:gridCol w:w="2493"/>
+        <w:gridCol w:w="2493"/>
+        <w:gridCol w:w="2493"/>
+        <w:gridCol w:w="2493"/>
+      </w:tblGrid>
+      <w:tr>
+        <w:tc>
+          <w:tcPr>
+            <w:tcW w:type="dxa" w:w="2493"/>
+          </w:tcPr>
+          <w:p>
+            <w:r>
+              <w:t>Требование</w:t>
+            </w:r>
+          </w:p>
+        </w:tc>
+        <w:tc>
+          <w:tcPr>
+            <w:tcW w:type="dxa" w:w="2493"/>
+          </w:tcPr>
+          <w:p>
+            <w:r>
+              <w:t>Реализация</w:t>
+            </w:r>
+          </w:p>
+        </w:tc>
+        <w:tc>
+          <w:tcPr>
+            <w:tcW w:type="dxa" w:w="2493"/>
+          </w:tcPr>
+          <w:p>
+            <w:r>
+              <w:t>Доказательство</w:t>
+            </w:r>
+          </w:p>
+        </w:tc>
+        <w:tc>
+          <w:tcPr>
+            <w:tcW w:type="dxa" w:w="2493"/>
+          </w:tcPr>
+          <w:p>
+            <w:r>
+              <w:t>Статус</w:t>
+            </w:r>
+          </w:p>
+        </w:tc>
+      </w:tr>
+      <w:tr>
+        <w:tc>
+          <w:tcPr>
+            <w:tcW w:type="dxa" w:w="2493"/>
+          </w:tcPr>
+          <w:p>
+            <w:r>
+              <w:t>1. Выбрать публичное веб-приложение и UI-элементы</w:t>
+            </w:r>
+          </w:p>
+        </w:tc>
+        <w:tc>
+          <w:tcPr>
+            <w:tcW w:type="dxa" w:w="2493"/>
+          </w:tcPr>
+          <w:p>
+            <w:r>
+              <w:t>Sauce Demo (saucedemo.com); login, inventory, dropdown, cart</w:t>
+            </w:r>
+          </w:p>
+        </w:tc>
+        <w:tc>
+          <w:tcPr>
+            <w:tcW w:type="dxa" w:w="2493"/>
+          </w:tcPr>
+          <w:p>
+            <w:r>
+              <w:t>docs + public_*.png</w:t>
+            </w:r>
+          </w:p>
+        </w:tc>
+        <w:tc>
+          <w:tcPr>
+            <w:tcW w:type="dxa" w:w="2493"/>
+          </w:tcPr>
+          <w:p>
+            <w:r>
+              <w:t>PASS</w:t>
+            </w:r>
+          </w:p>
+        </w:tc>
+      </w:tr>
+      <w:tr>
+        <w:tc>
+          <w:tcPr>
+            <w:tcW w:type="dxa" w:w="2493"/>
+          </w:tcPr>
+          <w:p>
+            <w:r>
+              <w:t>2. Настроить Selenium + test framework</w:t>
+            </w:r>
+          </w:p>
+        </w:tc>
+        <w:tc>
+          <w:tcPr>
+            <w:tcW w:type="dxa" w:w="2493"/>
+          </w:tcPr>
+          <w:p>
+            <w:r>
+              <w:t>pytest + Selenium 4.50 Chrome viewport 1400×1000</w:t>
+            </w:r>
+          </w:p>
+        </w:tc>
+        <w:tc>
+          <w:tcPr>
+            <w:tcW w:type="dxa" w:w="2493"/>
+          </w:tcPr>
+          <w:p>
+            <w:r>
+              <w:t>conftest / run_kt08.ps1</w:t>
+            </w:r>
+          </w:p>
+        </w:tc>
+        <w:tc>
+          <w:tcPr>
+            <w:tcW w:type="dxa" w:w="2493"/>
+          </w:tcPr>
+          <w:p>
+            <w:r>
+              <w:t>PASS</w:t>
+            </w:r>
+          </w:p>
+        </w:tc>
+      </w:tr>
+      <w:tr>
+        <w:tc>
+          <w:tcPr>
+            <w:tcW w:type="dxa" w:w="2493"/>
+          </w:tcPr>
+          <w:p>
+            <w:r>
+              <w:t>3. Интегрировать Allure</w:t>
+            </w:r>
+          </w:p>
+        </w:tc>
+        <w:tc>
+          <w:tcPr>
+            <w:tcW w:type="dxa" w:w="2493"/>
+          </w:tcPr>
+          <w:p>
+            <w:r>
+              <w:t>allure-pytest 2.16.2 + CLI 2.37.0</w:t>
+            </w:r>
+          </w:p>
+        </w:tc>
+        <w:tc>
+          <w:tcPr>
+            <w:tcW w:type="dxa" w:w="2493"/>
+          </w:tcPr>
+          <w:p>
+            <w:r>
+              <w:t>allure-results / allure-report</w:t>
+            </w:r>
+          </w:p>
+        </w:tc>
+        <w:tc>
+          <w:tcPr>
+            <w:tcW w:type="dxa" w:w="2493"/>
+          </w:tcPr>
+          <w:p>
+            <w:r>
+              <w:t>PASS</w:t>
+            </w:r>
+          </w:p>
+        </w:tc>
+      </w:tr>
+      <w:tr>
+        <w:tc>
+          <w:tcPr>
+            <w:tcW w:type="dxa" w:w="2493"/>
+          </w:tcPr>
+          <w:p>
+            <w:r>
+              <w:t>4. Автотесты скриншотов UI/страниц</w:t>
+            </w:r>
+          </w:p>
+        </w:tc>
+        <w:tc>
+          <w:tcPr>
+            <w:tcW w:type="dxa" w:w="2493"/>
+          </w:tcPr>
+          <w:p>
+            <w:r>
+              <w:t>4 public + 5 Pillow tests</w:t>
+            </w:r>
+          </w:p>
+        </w:tc>
+        <w:tc>
+          <w:tcPr>
+            <w:tcW w:type="dxa" w:w="2493"/>
+          </w:tcPr>
+          <w:p>
+            <w:r>
+              <w:t>test_kt08_*.py</w:t>
+            </w:r>
+          </w:p>
+        </w:tc>
+        <w:tc>
+          <w:tcPr>
+            <w:tcW w:type="dxa" w:w="2493"/>
+          </w:tcPr>
+          <w:p>
+            <w:r>
+              <w:t>PASS</w:t>
+            </w:r>
+          </w:p>
+        </w:tc>
+      </w:tr>
+      <w:tr>
+        <w:tc>
+          <w:tcPr>
+            <w:tcW w:type="dxa" w:w="2493"/>
+          </w:tcPr>
+          <w:p>
+            <w:r>
+              <w:t>5. Выполнить тесты и собрать скриншоты</w:t>
+            </w:r>
+          </w:p>
+        </w:tc>
+        <w:tc>
+          <w:tcPr>
+            <w:tcW w:type="dxa" w:w="2493"/>
+          </w:tcPr>
+          <w:p>
+            <w:r>
+              <w:t>Full 9 passed in 34.64s</w:t>
+            </w:r>
+          </w:p>
+        </w:tc>
+        <w:tc>
+          <w:tcPr>
+            <w:tcW w:type="dxa" w:w="2493"/>
+          </w:tcPr>
+          <w:p>
+            <w:r>
+              <w:t>screenshots/kt08/</w:t>
+            </w:r>
+          </w:p>
+        </w:tc>
+        <w:tc>
+          <w:tcPr>
+            <w:tcW w:type="dxa" w:w="2493"/>
+          </w:tcPr>
+          <w:p>
+            <w:r>
+              <w:t>PASS</w:t>
+            </w:r>
+          </w:p>
+        </w:tc>
+      </w:tr>
+      <w:tr>
+        <w:tc>
+          <w:tcPr>
+            <w:tcW w:type="dxa" w:w="2493"/>
+          </w:tcPr>
+          <w:p>
+            <w:r>
+              <w:t>6. Сгенерировать Allure HTML со скриншотами</w:t>
+            </w:r>
+          </w:p>
+        </w:tc>
+        <w:tc>
+          <w:tcPr>
+            <w:tcW w:type="dxa" w:w="2493"/>
+          </w:tcPr>
+          <w:p>
+            <w:r>
+              <w:t>allure generate → index.html; PNG в шагах</w:t>
+            </w:r>
+          </w:p>
+        </w:tc>
+        <w:tc>
+          <w:tcPr>
+            <w:tcW w:type="dxa" w:w="2493"/>
+          </w:tcPr>
+          <w:p>
+            <w:r>
+              <w:t>allure-report + allure_*.png</w:t>
+            </w:r>
+          </w:p>
+        </w:tc>
+        <w:tc>
+          <w:tcPr>
+            <w:tcW w:type="dxa" w:w="2493"/>
+          </w:tcPr>
+          <w:p>
+            <w:r>
+              <w:t>PASS</w:t>
+            </w:r>
+          </w:p>
+        </w:tc>
+      </w:tr>
+      <w:tr>
+        <w:tc>
+          <w:tcPr>
+            <w:tcW w:type="dxa" w:w="2493"/>
+          </w:tcPr>
+          <w:p>
+            <w:r>
+              <w:t>7. Анализ UI + отчёт с выводами</w:t>
+            </w:r>
+          </w:p>
+        </w:tc>
+        <w:tc>
+          <w:tcPr>
+            <w:tcW w:type="dxa" w:w="2493"/>
+          </w:tcPr>
+          <w:p>
+            <w:r>
+              <w:t>Этот DOCX + docs/kt08/</w:t>
+            </w:r>
+          </w:p>
+        </w:tc>
+        <w:tc>
+          <w:tcPr>
+            <w:tcW w:type="dxa" w:w="2493"/>
+          </w:tcPr>
+          <w:p>
+            <w:r>
+              <w:t>reports/KT08.docx</w:t>
+            </w:r>
+          </w:p>
+        </w:tc>
+        <w:tc>
+          <w:tcPr>
+            <w:tcW w:type="dxa" w:w="2493"/>
+          </w:tcPr>
+          <w:p>
+            <w:r>
+              <w:t>PASS</w:t>
+            </w:r>
+          </w:p>
+        </w:tc>
+      </w:tr>
+    </w:tbl>
+    <w:p>
+      <w:pPr>
+        <w:spacing w:after="120"/>
+      </w:pPr>
+      <w:r>
+        <w:rPr>
+          <w:rFonts w:ascii="Times New Roman" w:hAnsi="Times New Roman" w:eastAsia="Times New Roman"/>
+          <w:b w:val="0"/>
+          <w:sz w:val="24"/>
+        </w:rPr>
+      </w:r>
+    </w:p>
+    <w:p>
+      <w:pPr>
+        <w:pStyle w:val="Heading1"/>
+      </w:pPr>
+      <w:r>
+        <w:rPr>
+          <w:rFonts w:ascii="Times New Roman" w:hAnsi="Times New Roman" w:eastAsia="Times New Roman"/>
+          <w:b/>
+          <w:sz w:val="28"/>
+        </w:rPr>
+        <w:t>11. Заключение</w:t>
       </w:r>
     </w:p>
     <w:p>
@@ -1148,46 +1695,7 @@
           <w:b w:val="0"/>
           <w:sz w:val="24"/>
         </w:rPr>
-        <w:t>Плюсы: ловит визуальные дефекты; понятные overlay; детерминированные локальные фикстуры.</w:t>
-      </w:r>
-    </w:p>
-    <w:p>
-      <w:pPr>
-        <w:spacing w:after="120"/>
-      </w:pPr>
-      <w:r>
-        <w:rPr>
-          <w:rFonts w:ascii="Times New Roman" w:hAnsi="Times New Roman" w:eastAsia="Times New Roman"/>
-          <w:b w:val="0"/>
-          <w:sz w:val="24"/>
-        </w:rPr>
-        <w:t>Ограничения: чувствительность к DPI/шрифтам/версии Chrome; не заменяет функциональные проверки; шумные страницы требуют осторожного порога.</w:t>
-      </w:r>
-    </w:p>
-    <w:p>
-      <w:pPr>
-        <w:pStyle w:val="Heading1"/>
-      </w:pPr>
-      <w:r>
-        <w:rPr>
-          <w:rFonts w:ascii="Times New Roman" w:hAnsi="Times New Roman" w:eastAsia="Times New Roman"/>
-          <w:b/>
-          <w:sz w:val="28"/>
-        </w:rPr>
-        <w:t>9. Заключение</w:t>
-      </w:r>
-    </w:p>
-    <w:p>
-      <w:pPr>
-        <w:spacing w:after="120"/>
-      </w:pPr>
-      <w:r>
-        <w:rPr>
-          <w:rFonts w:ascii="Times New Roman" w:hAnsi="Times New Roman" w:eastAsia="Times New Roman"/>
-          <w:b w:val="0"/>
-          <w:sz w:val="24"/>
-        </w:rPr>
-        <w:t>КТ 08 выполнена: Pillow-утилита, approved baseline, 5 автотестов (match / text-color / layout / significant / dimensions), suite 5/5 PASS, артефакты и отчёт. KT09+ не начинались.</w:t>
+        <w:t>КТ 08 приведена в соответствие с оригинальной презентацией: публичный сайт, Allure HTML со скриншотами, 9/9 PASS в полном прогоне. Локальный Pillow-контур сохранён как дополнительная детерминированная проверка.</w:t>
       </w:r>
     </w:p>
     <w:sectPr>

</xml_diff>